<commit_message>
docs: update master doc
</commit_message>
<xml_diff>
--- a/Master-Document.docx
+++ b/Master-Document.docx
@@ -50,22 +50,22 @@
     <w:tbl>
       <w:tblPr>
         <w:tblW w:w="9000" w:type="dxa"/>
-        <w:jc w:val="start"/>
+        <w:jc w:val="left"/>
         <w:tblInd w:w="0" w:type="dxa"/>
         <w:tblLayout w:type="fixed"/>
         <w:tblCellMar>
           <w:top w:w="80" w:type="dxa"/>
-          <w:start w:w="120" w:type="dxa"/>
+          <w:left w:w="120" w:type="dxa"/>
           <w:bottom w:w="80" w:type="dxa"/>
-          <w:end w:w="120" w:type="dxa"/>
+          <w:right w:w="120" w:type="dxa"/>
         </w:tblCellMar>
-        <w:tblLook w:noHBand="0" w:noVBand="0" w:firstColumn="0" w:lastRow="0" w:lastColumn="0" w:firstRow="0" w:val="0000"/>
+        <w:tblLook w:val="0000" w:noHBand="0" w:noVBand="0" w:firstColumn="0" w:lastRow="0" w:lastColumn="0" w:firstRow="0"/>
       </w:tblPr>
       <w:tblGrid>
         <w:gridCol w:w="1800"/>
         <w:gridCol w:w="3600"/>
         <w:gridCol w:w="1600"/>
-        <w:gridCol w:w="2000"/>
+        <w:gridCol w:w="1999"/>
       </w:tblGrid>
       <w:tr>
         <w:trPr/>
@@ -74,9 +74,9 @@
             <w:tcW w:w="1800" w:type="dxa"/>
             <w:tcBorders>
               <w:top w:val="single" w:sz="4" w:space="0" w:color="000000"/>
-              <w:start w:val="single" w:sz="4" w:space="0" w:color="000000"/>
+              <w:left w:val="single" w:sz="4" w:space="0" w:color="000000"/>
               <w:bottom w:val="single" w:sz="4" w:space="0" w:color="000000"/>
-              <w:end w:val="single" w:sz="4" w:space="0" w:color="000000"/>
+              <w:right w:val="single" w:sz="4" w:space="0" w:color="000000"/>
             </w:tcBorders>
             <w:shd w:color="auto" w:fill="F3F6FC" w:val="clear"/>
             <w:vAlign w:val="center"/>
@@ -101,9 +101,9 @@
             <w:tcW w:w="3600" w:type="dxa"/>
             <w:tcBorders>
               <w:top w:val="single" w:sz="4" w:space="0" w:color="000000"/>
-              <w:start w:val="single" w:sz="4" w:space="0" w:color="000000"/>
+              <w:left w:val="single" w:sz="4" w:space="0" w:color="000000"/>
               <w:bottom w:val="single" w:sz="4" w:space="0" w:color="000000"/>
-              <w:end w:val="single" w:sz="4" w:space="0" w:color="000000"/>
+              <w:right w:val="single" w:sz="4" w:space="0" w:color="000000"/>
             </w:tcBorders>
             <w:shd w:color="auto" w:fill="A6E3A1" w:val="clear"/>
             <w:vAlign w:val="center"/>
@@ -126,9 +126,9 @@
             <w:tcW w:w="1600" w:type="dxa"/>
             <w:tcBorders>
               <w:top w:val="single" w:sz="4" w:space="0" w:color="000000"/>
-              <w:start w:val="single" w:sz="4" w:space="0" w:color="000000"/>
+              <w:left w:val="single" w:sz="4" w:space="0" w:color="000000"/>
               <w:bottom w:val="single" w:sz="4" w:space="0" w:color="000000"/>
-              <w:end w:val="single" w:sz="4" w:space="0" w:color="000000"/>
+              <w:right w:val="single" w:sz="4" w:space="0" w:color="000000"/>
             </w:tcBorders>
             <w:shd w:color="auto" w:fill="F3F6FC" w:val="clear"/>
             <w:vAlign w:val="center"/>
@@ -150,12 +150,12 @@
         </w:tc>
         <w:tc>
           <w:tcPr>
-            <w:tcW w:w="2000" w:type="dxa"/>
+            <w:tcW w:w="1999" w:type="dxa"/>
             <w:tcBorders>
               <w:top w:val="single" w:sz="4" w:space="0" w:color="000000"/>
-              <w:start w:val="single" w:sz="4" w:space="0" w:color="000000"/>
+              <w:left w:val="single" w:sz="4" w:space="0" w:color="000000"/>
               <w:bottom w:val="single" w:sz="4" w:space="0" w:color="000000"/>
-              <w:end w:val="single" w:sz="4" w:space="0" w:color="000000"/>
+              <w:right w:val="single" w:sz="4" w:space="0" w:color="000000"/>
             </w:tcBorders>
             <w:shd w:color="auto" w:fill="FFFFFF" w:val="clear"/>
             <w:vAlign w:val="center"/>
@@ -249,7 +249,7 @@
         <w:pStyle w:val="Normal"/>
         <w:shd w:val="clear" w:color="auto" w:fill="16204F"/>
         <w:spacing w:before="0" w:after="120"/>
-        <w:ind w:start="100" w:end="100"/>
+        <w:ind w:left="100" w:right="100"/>
         <w:rPr/>
       </w:pPr>
       <w:r>
@@ -292,22 +292,22 @@
     <w:tbl>
       <w:tblPr>
         <w:tblW w:w="9000" w:type="dxa"/>
-        <w:jc w:val="start"/>
+        <w:jc w:val="left"/>
         <w:tblInd w:w="0" w:type="dxa"/>
         <w:tblLayout w:type="fixed"/>
         <w:tblCellMar>
           <w:top w:w="80" w:type="dxa"/>
-          <w:start w:w="120" w:type="dxa"/>
+          <w:left w:w="120" w:type="dxa"/>
           <w:bottom w:w="80" w:type="dxa"/>
-          <w:end w:w="120" w:type="dxa"/>
+          <w:right w:w="120" w:type="dxa"/>
         </w:tblCellMar>
-        <w:tblLook w:noHBand="0" w:noVBand="0" w:firstColumn="0" w:lastRow="0" w:lastColumn="0" w:firstRow="0" w:val="0000"/>
+        <w:tblLook w:val="0000" w:noHBand="0" w:noVBand="0" w:firstColumn="0" w:lastRow="0" w:lastColumn="0" w:firstRow="0"/>
       </w:tblPr>
       <w:tblGrid>
         <w:gridCol w:w="1800"/>
         <w:gridCol w:w="3600"/>
         <w:gridCol w:w="1600"/>
-        <w:gridCol w:w="2000"/>
+        <w:gridCol w:w="1999"/>
       </w:tblGrid>
       <w:tr>
         <w:trPr/>
@@ -316,9 +316,9 @@
             <w:tcW w:w="1800" w:type="dxa"/>
             <w:tcBorders>
               <w:top w:val="single" w:sz="4" w:space="0" w:color="000000"/>
-              <w:start w:val="single" w:sz="4" w:space="0" w:color="000000"/>
+              <w:left w:val="single" w:sz="4" w:space="0" w:color="000000"/>
               <w:bottom w:val="single" w:sz="4" w:space="0" w:color="000000"/>
-              <w:end w:val="single" w:sz="4" w:space="0" w:color="000000"/>
+              <w:right w:val="single" w:sz="4" w:space="0" w:color="000000"/>
             </w:tcBorders>
             <w:shd w:color="auto" w:fill="F3F6FC" w:val="clear"/>
             <w:vAlign w:val="center"/>
@@ -343,9 +343,9 @@
             <w:tcW w:w="3600" w:type="dxa"/>
             <w:tcBorders>
               <w:top w:val="single" w:sz="4" w:space="0" w:color="000000"/>
-              <w:start w:val="single" w:sz="4" w:space="0" w:color="000000"/>
+              <w:left w:val="single" w:sz="4" w:space="0" w:color="000000"/>
               <w:bottom w:val="single" w:sz="4" w:space="0" w:color="000000"/>
-              <w:end w:val="single" w:sz="4" w:space="0" w:color="000000"/>
+              <w:right w:val="single" w:sz="4" w:space="0" w:color="000000"/>
             </w:tcBorders>
             <w:shd w:color="auto" w:fill="F9E2AF" w:val="clear"/>
             <w:vAlign w:val="center"/>
@@ -368,9 +368,9 @@
             <w:tcW w:w="1600" w:type="dxa"/>
             <w:tcBorders>
               <w:top w:val="single" w:sz="4" w:space="0" w:color="000000"/>
-              <w:start w:val="single" w:sz="4" w:space="0" w:color="000000"/>
+              <w:left w:val="single" w:sz="4" w:space="0" w:color="000000"/>
               <w:bottom w:val="single" w:sz="4" w:space="0" w:color="000000"/>
-              <w:end w:val="single" w:sz="4" w:space="0" w:color="000000"/>
+              <w:right w:val="single" w:sz="4" w:space="0" w:color="000000"/>
             </w:tcBorders>
             <w:shd w:color="auto" w:fill="F3F6FC" w:val="clear"/>
             <w:vAlign w:val="center"/>
@@ -392,12 +392,12 @@
         </w:tc>
         <w:tc>
           <w:tcPr>
-            <w:tcW w:w="2000" w:type="dxa"/>
+            <w:tcW w:w="1999" w:type="dxa"/>
             <w:tcBorders>
               <w:top w:val="single" w:sz="4" w:space="0" w:color="000000"/>
-              <w:start w:val="single" w:sz="4" w:space="0" w:color="000000"/>
+              <w:left w:val="single" w:sz="4" w:space="0" w:color="000000"/>
               <w:bottom w:val="single" w:sz="4" w:space="0" w:color="000000"/>
-              <w:end w:val="single" w:sz="4" w:space="0" w:color="000000"/>
+              <w:right w:val="single" w:sz="4" w:space="0" w:color="000000"/>
             </w:tcBorders>
             <w:shd w:color="auto" w:fill="FFFFFF" w:val="clear"/>
             <w:vAlign w:val="center"/>
@@ -508,7 +508,7 @@
           <wp:inline distT="0" distB="0" distL="0" distR="0">
             <wp:extent cx="3503930" cy="2589530"/>
             <wp:effectExtent l="0" t="0" r="0" b="0"/>
-            <wp:docPr id="1" name="Picture 1"/>
+            <wp:docPr id="1" name="Picture 1" descr=""/>
             <wp:cNvGraphicFramePr>
               <a:graphicFrameLocks xmlns:a="http://schemas.openxmlformats.org/drawingml/2006/main" noChangeAspect="1"/>
             </wp:cNvGraphicFramePr>
@@ -516,7 +516,7 @@
               <a:graphicData uri="http://schemas.openxmlformats.org/drawingml/2006/picture">
                 <pic:pic xmlns:pic="http://schemas.openxmlformats.org/drawingml/2006/picture">
                   <pic:nvPicPr>
-                    <pic:cNvPr id="1" name="Picture 1"/>
+                    <pic:cNvPr id="1" name="Picture 1" descr=""/>
                     <pic:cNvPicPr>
                       <a:picLocks noChangeAspect="1" noChangeArrowheads="1"/>
                     </pic:cNvPicPr>
@@ -568,22 +568,22 @@
     <w:tbl>
       <w:tblPr>
         <w:tblW w:w="9000" w:type="dxa"/>
-        <w:jc w:val="start"/>
+        <w:jc w:val="left"/>
         <w:tblInd w:w="0" w:type="dxa"/>
         <w:tblLayout w:type="fixed"/>
         <w:tblCellMar>
           <w:top w:w="80" w:type="dxa"/>
-          <w:start w:w="120" w:type="dxa"/>
+          <w:left w:w="120" w:type="dxa"/>
           <w:bottom w:w="80" w:type="dxa"/>
-          <w:end w:w="120" w:type="dxa"/>
+          <w:right w:w="120" w:type="dxa"/>
         </w:tblCellMar>
-        <w:tblLook w:noHBand="0" w:noVBand="0" w:firstColumn="0" w:lastRow="0" w:lastColumn="0" w:firstRow="0" w:val="0000"/>
+        <w:tblLook w:val="0000" w:noHBand="0" w:noVBand="0" w:firstColumn="0" w:lastRow="0" w:lastColumn="0" w:firstRow="0"/>
       </w:tblPr>
       <w:tblGrid>
         <w:gridCol w:w="1800"/>
         <w:gridCol w:w="3600"/>
         <w:gridCol w:w="1600"/>
-        <w:gridCol w:w="2000"/>
+        <w:gridCol w:w="1999"/>
       </w:tblGrid>
       <w:tr>
         <w:trPr/>
@@ -592,9 +592,9 @@
             <w:tcW w:w="1800" w:type="dxa"/>
             <w:tcBorders>
               <w:top w:val="single" w:sz="4" w:space="0" w:color="000000"/>
-              <w:start w:val="single" w:sz="4" w:space="0" w:color="000000"/>
+              <w:left w:val="single" w:sz="4" w:space="0" w:color="000000"/>
               <w:bottom w:val="single" w:sz="4" w:space="0" w:color="000000"/>
-              <w:end w:val="single" w:sz="4" w:space="0" w:color="000000"/>
+              <w:right w:val="single" w:sz="4" w:space="0" w:color="000000"/>
             </w:tcBorders>
             <w:shd w:color="auto" w:fill="F3F6FC" w:val="clear"/>
             <w:vAlign w:val="center"/>
@@ -619,9 +619,9 @@
             <w:tcW w:w="3600" w:type="dxa"/>
             <w:tcBorders>
               <w:top w:val="single" w:sz="4" w:space="0" w:color="000000"/>
-              <w:start w:val="single" w:sz="4" w:space="0" w:color="000000"/>
+              <w:left w:val="single" w:sz="4" w:space="0" w:color="000000"/>
               <w:bottom w:val="single" w:sz="4" w:space="0" w:color="000000"/>
-              <w:end w:val="single" w:sz="4" w:space="0" w:color="000000"/>
+              <w:right w:val="single" w:sz="4" w:space="0" w:color="000000"/>
             </w:tcBorders>
             <w:shd w:color="auto" w:fill="A6E3A1" w:val="clear"/>
             <w:vAlign w:val="center"/>
@@ -648,9 +648,9 @@
             <w:tcW w:w="1600" w:type="dxa"/>
             <w:tcBorders>
               <w:top w:val="single" w:sz="4" w:space="0" w:color="000000"/>
-              <w:start w:val="single" w:sz="4" w:space="0" w:color="000000"/>
+              <w:left w:val="single" w:sz="4" w:space="0" w:color="000000"/>
               <w:bottom w:val="single" w:sz="4" w:space="0" w:color="000000"/>
-              <w:end w:val="single" w:sz="4" w:space="0" w:color="000000"/>
+              <w:right w:val="single" w:sz="4" w:space="0" w:color="000000"/>
             </w:tcBorders>
             <w:shd w:color="auto" w:fill="F3F6FC" w:val="clear"/>
             <w:vAlign w:val="center"/>
@@ -672,12 +672,12 @@
         </w:tc>
         <w:tc>
           <w:tcPr>
-            <w:tcW w:w="2000" w:type="dxa"/>
+            <w:tcW w:w="1999" w:type="dxa"/>
             <w:tcBorders>
               <w:top w:val="single" w:sz="4" w:space="0" w:color="000000"/>
-              <w:start w:val="single" w:sz="4" w:space="0" w:color="000000"/>
+              <w:left w:val="single" w:sz="4" w:space="0" w:color="000000"/>
               <w:bottom w:val="single" w:sz="4" w:space="0" w:color="000000"/>
-              <w:end w:val="single" w:sz="4" w:space="0" w:color="000000"/>
+              <w:right w:val="single" w:sz="4" w:space="0" w:color="000000"/>
             </w:tcBorders>
             <w:shd w:color="auto" w:fill="FFFFFF" w:val="clear"/>
             <w:vAlign w:val="center"/>
@@ -771,7 +771,7 @@
         <w:pStyle w:val="Normal"/>
         <w:shd w:val="clear" w:color="auto" w:fill="16204F"/>
         <w:spacing w:before="0" w:after="120"/>
-        <w:ind w:start="100" w:end="100"/>
+        <w:ind w:left="100" w:right="100"/>
         <w:rPr/>
       </w:pPr>
       <w:r>
@@ -814,22 +814,22 @@
     <w:tbl>
       <w:tblPr>
         <w:tblW w:w="9000" w:type="dxa"/>
-        <w:jc w:val="start"/>
+        <w:jc w:val="left"/>
         <w:tblInd w:w="0" w:type="dxa"/>
         <w:tblLayout w:type="fixed"/>
         <w:tblCellMar>
           <w:top w:w="80" w:type="dxa"/>
-          <w:start w:w="120" w:type="dxa"/>
+          <w:left w:w="120" w:type="dxa"/>
           <w:bottom w:w="80" w:type="dxa"/>
-          <w:end w:w="120" w:type="dxa"/>
+          <w:right w:w="120" w:type="dxa"/>
         </w:tblCellMar>
-        <w:tblLook w:noHBand="0" w:noVBand="0" w:firstColumn="0" w:lastRow="0" w:lastColumn="0" w:firstRow="0" w:val="0000"/>
+        <w:tblLook w:val="0000" w:noHBand="0" w:noVBand="0" w:firstColumn="0" w:lastRow="0" w:lastColumn="0" w:firstRow="0"/>
       </w:tblPr>
       <w:tblGrid>
         <w:gridCol w:w="1800"/>
         <w:gridCol w:w="3600"/>
         <w:gridCol w:w="1600"/>
-        <w:gridCol w:w="2000"/>
+        <w:gridCol w:w="1999"/>
       </w:tblGrid>
       <w:tr>
         <w:trPr/>
@@ -838,9 +838,9 @@
             <w:tcW w:w="1800" w:type="dxa"/>
             <w:tcBorders>
               <w:top w:val="single" w:sz="4" w:space="0" w:color="000000"/>
-              <w:start w:val="single" w:sz="4" w:space="0" w:color="000000"/>
+              <w:left w:val="single" w:sz="4" w:space="0" w:color="000000"/>
               <w:bottom w:val="single" w:sz="4" w:space="0" w:color="000000"/>
-              <w:end w:val="single" w:sz="4" w:space="0" w:color="000000"/>
+              <w:right w:val="single" w:sz="4" w:space="0" w:color="000000"/>
             </w:tcBorders>
             <w:shd w:color="auto" w:fill="F3F6FC" w:val="clear"/>
             <w:vAlign w:val="center"/>
@@ -865,9 +865,9 @@
             <w:tcW w:w="3600" w:type="dxa"/>
             <w:tcBorders>
               <w:top w:val="single" w:sz="4" w:space="0" w:color="000000"/>
-              <w:start w:val="single" w:sz="4" w:space="0" w:color="000000"/>
+              <w:left w:val="single" w:sz="4" w:space="0" w:color="000000"/>
               <w:bottom w:val="single" w:sz="4" w:space="0" w:color="000000"/>
-              <w:end w:val="single" w:sz="4" w:space="0" w:color="000000"/>
+              <w:right w:val="single" w:sz="4" w:space="0" w:color="000000"/>
             </w:tcBorders>
             <w:shd w:color="auto" w:fill="CBA6F7" w:val="clear"/>
             <w:vAlign w:val="center"/>
@@ -881,13 +881,7 @@
               <w:rPr>
                 <w:color w:val="1E2761"/>
               </w:rPr>
-              <w:t xml:space="preserve">Dev 1 — </w:t>
-            </w:r>
-            <w:r>
-              <w:rPr>
-                <w:color w:val="1E2761"/>
-              </w:rPr>
-              <w:t>Aditya Lonkar</w:t>
+              <w:t>Dev 1 — Aditya Lonkar</w:t>
             </w:r>
           </w:p>
         </w:tc>
@@ -896,9 +890,9 @@
             <w:tcW w:w="1600" w:type="dxa"/>
             <w:tcBorders>
               <w:top w:val="single" w:sz="4" w:space="0" w:color="000000"/>
-              <w:start w:val="single" w:sz="4" w:space="0" w:color="000000"/>
+              <w:left w:val="single" w:sz="4" w:space="0" w:color="000000"/>
               <w:bottom w:val="single" w:sz="4" w:space="0" w:color="000000"/>
-              <w:end w:val="single" w:sz="4" w:space="0" w:color="000000"/>
+              <w:right w:val="single" w:sz="4" w:space="0" w:color="000000"/>
             </w:tcBorders>
             <w:shd w:color="auto" w:fill="F3F6FC" w:val="clear"/>
             <w:vAlign w:val="center"/>
@@ -920,12 +914,12 @@
         </w:tc>
         <w:tc>
           <w:tcPr>
-            <w:tcW w:w="2000" w:type="dxa"/>
+            <w:tcW w:w="1999" w:type="dxa"/>
             <w:tcBorders>
               <w:top w:val="single" w:sz="4" w:space="0" w:color="000000"/>
-              <w:start w:val="single" w:sz="4" w:space="0" w:color="000000"/>
+              <w:left w:val="single" w:sz="4" w:space="0" w:color="000000"/>
               <w:bottom w:val="single" w:sz="4" w:space="0" w:color="000000"/>
-              <w:end w:val="single" w:sz="4" w:space="0" w:color="000000"/>
+              <w:right w:val="single" w:sz="4" w:space="0" w:color="000000"/>
             </w:tcBorders>
             <w:shd w:color="auto" w:fill="FFFFFF" w:val="clear"/>
             <w:vAlign w:val="center"/>
@@ -939,25 +933,7 @@
               <w:rPr>
                 <w:color w:val="1E2761"/>
               </w:rPr>
-              <w:t>Friday</w:t>
-            </w:r>
-            <w:r>
-              <w:rPr>
-                <w:color w:val="1E2761"/>
-              </w:rPr>
-              <w:t xml:space="preserve">, </w:t>
-            </w:r>
-            <w:r>
-              <w:rPr>
-                <w:color w:val="1E2761"/>
-              </w:rPr>
-              <w:t>14</w:t>
-            </w:r>
-            <w:r>
-              <w:rPr>
-                <w:color w:val="1E2761"/>
-              </w:rPr>
-              <w:t xml:space="preserve"> August 2026</w:t>
+              <w:t>Friday, 14 August 2026</w:t>
             </w:r>
           </w:p>
         </w:tc>
@@ -1029,11 +1005,7 @@
       </w:r>
       <w:r>
         <w:rPr/>
-        <w:t xml:space="preserve">Nothing blocking — </w:t>
-      </w:r>
-      <w:r>
-        <w:rPr/>
-        <w:t>Dev 2/PM building team page.</w:t>
+        <w:t>Nothing blocking — Dev 2/PM building team page.</w:t>
       </w:r>
     </w:p>
     <w:p>
@@ -1041,7 +1013,7 @@
         <w:pStyle w:val="Normal"/>
         <w:shd w:val="clear" w:color="auto" w:fill="16204F"/>
         <w:spacing w:before="0" w:after="120"/>
-        <w:ind w:start="100" w:end="100"/>
+        <w:ind w:left="100" w:right="100"/>
         <w:rPr>
           <w:rFonts w:ascii="Consolas" w:hAnsi="Consolas" w:eastAsia="Consolas" w:cs="Consolas"/>
           <w:color w:val="8FD3D6"/>
@@ -1061,7 +1033,7 @@
         <w:pStyle w:val="Normal"/>
         <w:shd w:val="clear" w:color="auto" w:fill="16204F"/>
         <w:spacing w:before="0" w:after="120"/>
-        <w:ind w:start="100" w:end="100"/>
+        <w:ind w:left="100" w:right="100"/>
         <w:rPr>
           <w:rFonts w:ascii="Consolas" w:hAnsi="Consolas" w:eastAsia="Consolas" w:cs="Consolas"/>
           <w:color w:val="8FD3D6"/>
@@ -1088,18 +1060,7 @@
           <w:color w:val="FFFFFF"/>
           <w:u w:val="none"/>
         </w:rPr>
-        <w:t xml:space="preserve"> – </w:t>
-      </w:r>
-      <w:r>
-        <w:rPr>
-          <w:rStyle w:val="Hyperlink"/>
-          <w:rFonts w:eastAsia="Consolas" w:cs="Consolas" w:ascii="Consolas" w:hAnsi="Consolas"/>
-          <w:b w:val="false"/>
-          <w:bCs w:val="false"/>
-          <w:color w:val="FFFFFF"/>
-          <w:u w:val="none"/>
-        </w:rPr>
-        <w:t>redesign incomplete – merged due to PM and repository change.</w:t>
+        <w:t xml:space="preserve"> – redesign incomplete – merged due to PM and repository change.</w:t>
       </w:r>
     </w:p>
     <w:p>
@@ -1107,7 +1068,7 @@
         <w:pStyle w:val="Normal"/>
         <w:shd w:val="clear" w:color="auto" w:fill="16204F"/>
         <w:spacing w:before="0" w:after="120"/>
-        <w:ind w:start="100" w:end="100"/>
+        <w:ind w:left="100" w:right="100"/>
         <w:rPr>
           <w:rFonts w:ascii="Consolas" w:hAnsi="Consolas" w:eastAsia="Consolas" w:cs="Consolas"/>
           <w:color w:val="8FD3D6"/>
@@ -1144,7 +1105,7 @@
         <w:pStyle w:val="Normal"/>
         <w:shd w:val="clear" w:color="auto" w:fill="16204F"/>
         <w:spacing w:before="0" w:after="120"/>
-        <w:ind w:start="100" w:end="100"/>
+        <w:ind w:left="100" w:right="100"/>
         <w:rPr/>
       </w:pPr>
       <w:r>
@@ -1177,13 +1138,13 @@
         <w:pStyle w:val="Normal"/>
         <w:shd w:val="clear" w:color="auto" w:fill="16204F"/>
         <w:spacing w:before="0" w:after="120"/>
-        <w:ind w:start="100" w:end="100"/>
+        <w:ind w:left="100" w:right="100"/>
         <w:rPr/>
       </w:pPr>
       <w:r>
         <w:rPr/>
         <w:drawing>
-          <wp:anchor distT="0" distB="0" distL="0" distR="0" simplePos="0" relativeHeight="10" behindDoc="0" locked="0" layoutInCell="0" allowOverlap="1">
+          <wp:anchor behindDoc="0" distT="0" distB="0" distL="0" distR="0" simplePos="0" locked="0" layoutInCell="0" allowOverlap="1" relativeHeight="10">
             <wp:simplePos x="0" y="0"/>
             <wp:positionH relativeFrom="column">
               <wp:align>center</wp:align>
@@ -1194,7 +1155,7 @@
             <wp:extent cx="5816600" cy="2915285"/>
             <wp:effectExtent l="0" t="0" r="0" b="0"/>
             <wp:wrapSquare wrapText="largest"/>
-            <wp:docPr id="2" name="Image3"/>
+            <wp:docPr id="2" name="Image3" descr=""/>
             <wp:cNvGraphicFramePr>
               <a:graphicFrameLocks xmlns:a="http://schemas.openxmlformats.org/drawingml/2006/main" noChangeAspect="1"/>
             </wp:cNvGraphicFramePr>
@@ -1202,7 +1163,7 @@
               <a:graphicData uri="http://schemas.openxmlformats.org/drawingml/2006/picture">
                 <pic:pic xmlns:pic="http://schemas.openxmlformats.org/drawingml/2006/picture">
                   <pic:nvPicPr>
-                    <pic:cNvPr id="2" name="Image3"/>
+                    <pic:cNvPr id="2" name="Image3" descr=""/>
                     <pic:cNvPicPr>
                       <a:picLocks noChangeAspect="1" noChangeArrowheads="1"/>
                     </pic:cNvPicPr>
@@ -1235,13 +1196,13 @@
         <w:pStyle w:val="Normal"/>
         <w:shd w:val="clear" w:color="auto" w:fill="16204F"/>
         <w:spacing w:before="0" w:after="120"/>
-        <w:ind w:start="100" w:end="100"/>
+        <w:ind w:left="100" w:right="100"/>
         <w:rPr/>
       </w:pPr>
       <w:r>
         <w:rPr/>
         <w:drawing>
-          <wp:anchor distT="0" distB="0" distL="0" distR="0" simplePos="0" relativeHeight="9" behindDoc="0" locked="0" layoutInCell="0" allowOverlap="1">
+          <wp:anchor behindDoc="0" distT="0" distB="0" distL="0" distR="0" simplePos="0" locked="0" layoutInCell="0" allowOverlap="1" relativeHeight="9">
             <wp:simplePos x="0" y="0"/>
             <wp:positionH relativeFrom="column">
               <wp:align>center</wp:align>
@@ -1252,7 +1213,7 @@
             <wp:extent cx="5816600" cy="2915285"/>
             <wp:effectExtent l="0" t="0" r="0" b="0"/>
             <wp:wrapSquare wrapText="largest"/>
-            <wp:docPr id="3" name="Image1"/>
+            <wp:docPr id="3" name="Image1" descr=""/>
             <wp:cNvGraphicFramePr>
               <a:graphicFrameLocks xmlns:a="http://schemas.openxmlformats.org/drawingml/2006/main" noChangeAspect="1"/>
             </wp:cNvGraphicFramePr>
@@ -1260,7 +1221,7 @@
               <a:graphicData uri="http://schemas.openxmlformats.org/drawingml/2006/picture">
                 <pic:pic xmlns:pic="http://schemas.openxmlformats.org/drawingml/2006/picture">
                   <pic:nvPicPr>
-                    <pic:cNvPr id="3" name="Image1"/>
+                    <pic:cNvPr id="3" name="Image1" descr=""/>
                     <pic:cNvPicPr>
                       <a:picLocks noChangeAspect="1" noChangeArrowheads="1"/>
                     </pic:cNvPicPr>
@@ -1312,22 +1273,22 @@
     <w:tbl>
       <w:tblPr>
         <w:tblW w:w="9000" w:type="dxa"/>
-        <w:jc w:val="start"/>
+        <w:jc w:val="left"/>
         <w:tblInd w:w="0" w:type="dxa"/>
         <w:tblLayout w:type="fixed"/>
         <w:tblCellMar>
           <w:top w:w="80" w:type="dxa"/>
-          <w:start w:w="120" w:type="dxa"/>
+          <w:left w:w="120" w:type="dxa"/>
           <w:bottom w:w="80" w:type="dxa"/>
-          <w:end w:w="120" w:type="dxa"/>
+          <w:right w:w="120" w:type="dxa"/>
         </w:tblCellMar>
-        <w:tblLook w:noHBand="0" w:noVBand="0" w:firstColumn="0" w:lastRow="0" w:lastColumn="0" w:firstRow="0" w:val="0000"/>
+        <w:tblLook w:val="0000" w:noHBand="0" w:noVBand="0" w:firstColumn="0" w:lastRow="0" w:lastColumn="0" w:firstRow="0"/>
       </w:tblPr>
       <w:tblGrid>
         <w:gridCol w:w="1800"/>
         <w:gridCol w:w="3600"/>
         <w:gridCol w:w="1600"/>
-        <w:gridCol w:w="2000"/>
+        <w:gridCol w:w="1999"/>
       </w:tblGrid>
       <w:tr>
         <w:trPr/>
@@ -1336,9 +1297,9 @@
             <w:tcW w:w="1800" w:type="dxa"/>
             <w:tcBorders>
               <w:top w:val="single" w:sz="4" w:space="0" w:color="000000"/>
-              <w:start w:val="single" w:sz="4" w:space="0" w:color="000000"/>
+              <w:left w:val="single" w:sz="4" w:space="0" w:color="000000"/>
               <w:bottom w:val="single" w:sz="4" w:space="0" w:color="000000"/>
-              <w:end w:val="single" w:sz="4" w:space="0" w:color="000000"/>
+              <w:right w:val="single" w:sz="4" w:space="0" w:color="000000"/>
             </w:tcBorders>
             <w:shd w:color="auto" w:fill="F3F6FC" w:val="clear"/>
             <w:vAlign w:val="center"/>
@@ -1363,9 +1324,9 @@
             <w:tcW w:w="3600" w:type="dxa"/>
             <w:tcBorders>
               <w:top w:val="single" w:sz="4" w:space="0" w:color="000000"/>
-              <w:start w:val="single" w:sz="4" w:space="0" w:color="000000"/>
+              <w:left w:val="single" w:sz="4" w:space="0" w:color="000000"/>
               <w:bottom w:val="single" w:sz="4" w:space="0" w:color="000000"/>
-              <w:end w:val="single" w:sz="4" w:space="0" w:color="000000"/>
+              <w:right w:val="single" w:sz="4" w:space="0" w:color="000000"/>
             </w:tcBorders>
             <w:shd w:color="auto" w:fill="CBA6F7" w:val="clear"/>
             <w:vAlign w:val="center"/>
@@ -1379,19 +1340,13 @@
               <w:rPr>
                 <w:color w:val="1E2761"/>
               </w:rPr>
-              <w:t xml:space="preserve">Dev </w:t>
+              <w:t xml:space="preserve">Dev 2 — </w:t>
             </w:r>
             <w:r>
               <w:rPr>
                 <w:color w:val="1E2761"/>
               </w:rPr>
-              <w:t>2</w:t>
-            </w:r>
-            <w:r>
-              <w:rPr>
-                <w:color w:val="1E2761"/>
-              </w:rPr>
-              <w:t xml:space="preserve"> — Riley Chen</w:t>
+              <w:t>Grace Bigwood</w:t>
             </w:r>
           </w:p>
         </w:tc>
@@ -1400,9 +1355,9 @@
             <w:tcW w:w="1600" w:type="dxa"/>
             <w:tcBorders>
               <w:top w:val="single" w:sz="4" w:space="0" w:color="000000"/>
-              <w:start w:val="single" w:sz="4" w:space="0" w:color="000000"/>
+              <w:left w:val="single" w:sz="4" w:space="0" w:color="000000"/>
               <w:bottom w:val="single" w:sz="4" w:space="0" w:color="000000"/>
-              <w:end w:val="single" w:sz="4" w:space="0" w:color="000000"/>
+              <w:right w:val="single" w:sz="4" w:space="0" w:color="000000"/>
             </w:tcBorders>
             <w:shd w:color="auto" w:fill="F3F6FC" w:val="clear"/>
             <w:vAlign w:val="center"/>
@@ -1424,12 +1379,12 @@
         </w:tc>
         <w:tc>
           <w:tcPr>
-            <w:tcW w:w="2000" w:type="dxa"/>
+            <w:tcW w:w="1999" w:type="dxa"/>
             <w:tcBorders>
               <w:top w:val="single" w:sz="4" w:space="0" w:color="000000"/>
-              <w:start w:val="single" w:sz="4" w:space="0" w:color="000000"/>
+              <w:left w:val="single" w:sz="4" w:space="0" w:color="000000"/>
               <w:bottom w:val="single" w:sz="4" w:space="0" w:color="000000"/>
-              <w:end w:val="single" w:sz="4" w:space="0" w:color="000000"/>
+              <w:right w:val="single" w:sz="4" w:space="0" w:color="000000"/>
             </w:tcBorders>
             <w:shd w:color="auto" w:fill="FFFFFF" w:val="clear"/>
             <w:vAlign w:val="center"/>
@@ -1443,7 +1398,25 @@
               <w:rPr>
                 <w:color w:val="1E2761"/>
               </w:rPr>
-              <w:t>Wednesday, 5 August 2026</w:t>
+              <w:t>Friday</w:t>
+            </w:r>
+            <w:r>
+              <w:rPr>
+                <w:color w:val="1E2761"/>
+              </w:rPr>
+              <w:t xml:space="preserve">, </w:t>
+            </w:r>
+            <w:r>
+              <w:rPr>
+                <w:color w:val="1E2761"/>
+              </w:rPr>
+              <w:t>14</w:t>
+            </w:r>
+            <w:r>
+              <w:rPr>
+                <w:color w:val="1E2761"/>
+              </w:rPr>
+              <w:t xml:space="preserve"> August 2026</w:t>
             </w:r>
           </w:p>
         </w:tc>
@@ -1523,7 +1496,7 @@
         <w:pStyle w:val="Normal"/>
         <w:shd w:val="clear" w:color="auto" w:fill="16204F"/>
         <w:spacing w:before="0" w:after="120"/>
-        <w:ind w:start="100" w:end="100"/>
+        <w:ind w:left="100" w:right="100"/>
         <w:rPr/>
       </w:pPr>
       <w:r>
@@ -1554,7 +1527,7 @@
           <wp:inline distT="0" distB="0" distL="0" distR="0">
             <wp:extent cx="3503930" cy="2589530"/>
             <wp:effectExtent l="0" t="0" r="0" b="0"/>
-            <wp:docPr id="4" name="Picture 3"/>
+            <wp:docPr id="4" name="Picture 3" descr=""/>
             <wp:cNvGraphicFramePr>
               <a:graphicFrameLocks xmlns:a="http://schemas.openxmlformats.org/drawingml/2006/main" noChangeAspect="1"/>
             </wp:cNvGraphicFramePr>
@@ -1562,7 +1535,7 @@
               <a:graphicData uri="http://schemas.openxmlformats.org/drawingml/2006/picture">
                 <pic:pic xmlns:pic="http://schemas.openxmlformats.org/drawingml/2006/picture">
                   <pic:nvPicPr>
-                    <pic:cNvPr id="4" name="Picture 3"/>
+                    <pic:cNvPr id="4" name="Picture 3" descr=""/>
                     <pic:cNvPicPr>
                       <a:picLocks noChangeAspect="1" noChangeArrowheads="1"/>
                     </pic:cNvPicPr>
@@ -1604,22 +1577,22 @@
     <w:tbl>
       <w:tblPr>
         <w:tblW w:w="9000" w:type="dxa"/>
-        <w:jc w:val="start"/>
+        <w:jc w:val="left"/>
         <w:tblInd w:w="0" w:type="dxa"/>
         <w:tblLayout w:type="fixed"/>
         <w:tblCellMar>
           <w:top w:w="80" w:type="dxa"/>
-          <w:start w:w="120" w:type="dxa"/>
+          <w:left w:w="120" w:type="dxa"/>
           <w:bottom w:w="80" w:type="dxa"/>
-          <w:end w:w="120" w:type="dxa"/>
+          <w:right w:w="120" w:type="dxa"/>
         </w:tblCellMar>
-        <w:tblLook w:noHBand="0" w:noVBand="0" w:firstColumn="0" w:lastRow="0" w:lastColumn="0" w:firstRow="0" w:val="0000"/>
+        <w:tblLook w:val="0000" w:noHBand="0" w:noVBand="0" w:firstColumn="0" w:lastRow="0" w:lastColumn="0" w:firstRow="0"/>
       </w:tblPr>
       <w:tblGrid>
         <w:gridCol w:w="1800"/>
         <w:gridCol w:w="3600"/>
         <w:gridCol w:w="1600"/>
-        <w:gridCol w:w="2000"/>
+        <w:gridCol w:w="1999"/>
       </w:tblGrid>
       <w:tr>
         <w:trPr/>
@@ -1628,9 +1601,9 @@
             <w:tcW w:w="1800" w:type="dxa"/>
             <w:tcBorders>
               <w:top w:val="single" w:sz="4" w:space="0" w:color="000000"/>
-              <w:start w:val="single" w:sz="4" w:space="0" w:color="000000"/>
+              <w:left w:val="single" w:sz="4" w:space="0" w:color="000000"/>
               <w:bottom w:val="single" w:sz="4" w:space="0" w:color="000000"/>
-              <w:end w:val="single" w:sz="4" w:space="0" w:color="000000"/>
+              <w:right w:val="single" w:sz="4" w:space="0" w:color="000000"/>
             </w:tcBorders>
             <w:shd w:color="auto" w:fill="F3F6FC" w:val="clear"/>
             <w:vAlign w:val="center"/>
@@ -1655,9 +1628,9 @@
             <w:tcW w:w="3600" w:type="dxa"/>
             <w:tcBorders>
               <w:top w:val="single" w:sz="4" w:space="0" w:color="000000"/>
-              <w:start w:val="single" w:sz="4" w:space="0" w:color="000000"/>
+              <w:left w:val="single" w:sz="4" w:space="0" w:color="000000"/>
               <w:bottom w:val="single" w:sz="4" w:space="0" w:color="000000"/>
-              <w:end w:val="single" w:sz="4" w:space="0" w:color="000000"/>
+              <w:right w:val="single" w:sz="4" w:space="0" w:color="000000"/>
             </w:tcBorders>
             <w:shd w:color="auto" w:fill="FAB387" w:val="clear"/>
             <w:vAlign w:val="center"/>
@@ -1680,9 +1653,9 @@
             <w:tcW w:w="1600" w:type="dxa"/>
             <w:tcBorders>
               <w:top w:val="single" w:sz="4" w:space="0" w:color="000000"/>
-              <w:start w:val="single" w:sz="4" w:space="0" w:color="000000"/>
+              <w:left w:val="single" w:sz="4" w:space="0" w:color="000000"/>
               <w:bottom w:val="single" w:sz="4" w:space="0" w:color="000000"/>
-              <w:end w:val="single" w:sz="4" w:space="0" w:color="000000"/>
+              <w:right w:val="single" w:sz="4" w:space="0" w:color="000000"/>
             </w:tcBorders>
             <w:shd w:color="auto" w:fill="F3F6FC" w:val="clear"/>
             <w:vAlign w:val="center"/>
@@ -1704,12 +1677,12 @@
         </w:tc>
         <w:tc>
           <w:tcPr>
-            <w:tcW w:w="2000" w:type="dxa"/>
+            <w:tcW w:w="1999" w:type="dxa"/>
             <w:tcBorders>
               <w:top w:val="single" w:sz="4" w:space="0" w:color="000000"/>
-              <w:start w:val="single" w:sz="4" w:space="0" w:color="000000"/>
+              <w:left w:val="single" w:sz="4" w:space="0" w:color="000000"/>
               <w:bottom w:val="single" w:sz="4" w:space="0" w:color="000000"/>
-              <w:end w:val="single" w:sz="4" w:space="0" w:color="000000"/>
+              <w:right w:val="single" w:sz="4" w:space="0" w:color="000000"/>
             </w:tcBorders>
             <w:shd w:color="auto" w:fill="FFFFFF" w:val="clear"/>
             <w:vAlign w:val="center"/>
@@ -1803,7 +1776,7 @@
         <w:pStyle w:val="Normal"/>
         <w:shd w:val="clear" w:color="auto" w:fill="16204F"/>
         <w:spacing w:before="0" w:after="120"/>
-        <w:ind w:start="100" w:end="100"/>
+        <w:ind w:left="100" w:right="100"/>
         <w:rPr/>
       </w:pPr>
       <w:r>
@@ -1827,7 +1800,7 @@
         <w:pStyle w:val="Normal"/>
         <w:shd w:val="clear" w:color="auto" w:fill="16204F"/>
         <w:spacing w:before="0" w:after="120"/>
-        <w:ind w:start="100" w:end="100"/>
+        <w:ind w:left="100" w:right="100"/>
         <w:rPr/>
       </w:pPr>
       <w:r>
@@ -1870,22 +1843,22 @@
     <w:tbl>
       <w:tblPr>
         <w:tblW w:w="9000" w:type="dxa"/>
-        <w:jc w:val="start"/>
+        <w:jc w:val="left"/>
         <w:tblInd w:w="0" w:type="dxa"/>
         <w:tblLayout w:type="fixed"/>
         <w:tblCellMar>
           <w:top w:w="80" w:type="dxa"/>
-          <w:start w:w="120" w:type="dxa"/>
+          <w:left w:w="120" w:type="dxa"/>
           <w:bottom w:w="80" w:type="dxa"/>
-          <w:end w:w="120" w:type="dxa"/>
+          <w:right w:w="120" w:type="dxa"/>
         </w:tblCellMar>
-        <w:tblLook w:noHBand="0" w:noVBand="0" w:firstColumn="0" w:lastRow="0" w:lastColumn="0" w:firstRow="0" w:val="0000"/>
+        <w:tblLook w:val="0000" w:noHBand="0" w:noVBand="0" w:firstColumn="0" w:lastRow="0" w:lastColumn="0" w:firstRow="0"/>
       </w:tblPr>
       <w:tblGrid>
         <w:gridCol w:w="1800"/>
         <w:gridCol w:w="3600"/>
         <w:gridCol w:w="1600"/>
-        <w:gridCol w:w="2000"/>
+        <w:gridCol w:w="1999"/>
       </w:tblGrid>
       <w:tr>
         <w:trPr/>
@@ -1894,9 +1867,9 @@
             <w:tcW w:w="1800" w:type="dxa"/>
             <w:tcBorders>
               <w:top w:val="single" w:sz="4" w:space="0" w:color="000000"/>
-              <w:start w:val="single" w:sz="4" w:space="0" w:color="000000"/>
+              <w:left w:val="single" w:sz="4" w:space="0" w:color="000000"/>
               <w:bottom w:val="single" w:sz="4" w:space="0" w:color="000000"/>
-              <w:end w:val="single" w:sz="4" w:space="0" w:color="000000"/>
+              <w:right w:val="single" w:sz="4" w:space="0" w:color="000000"/>
             </w:tcBorders>
             <w:shd w:color="auto" w:fill="F3F6FC" w:val="clear"/>
             <w:vAlign w:val="center"/>
@@ -1921,9 +1894,9 @@
             <w:tcW w:w="3600" w:type="dxa"/>
             <w:tcBorders>
               <w:top w:val="single" w:sz="4" w:space="0" w:color="000000"/>
-              <w:start w:val="single" w:sz="4" w:space="0" w:color="000000"/>
+              <w:left w:val="single" w:sz="4" w:space="0" w:color="000000"/>
               <w:bottom w:val="single" w:sz="4" w:space="0" w:color="000000"/>
-              <w:end w:val="single" w:sz="4" w:space="0" w:color="000000"/>
+              <w:right w:val="single" w:sz="4" w:space="0" w:color="000000"/>
             </w:tcBorders>
             <w:shd w:color="auto" w:fill="FAB387" w:val="clear"/>
             <w:vAlign w:val="center"/>
@@ -1946,9 +1919,9 @@
             <w:tcW w:w="1600" w:type="dxa"/>
             <w:tcBorders>
               <w:top w:val="single" w:sz="4" w:space="0" w:color="000000"/>
-              <w:start w:val="single" w:sz="4" w:space="0" w:color="000000"/>
+              <w:left w:val="single" w:sz="4" w:space="0" w:color="000000"/>
               <w:bottom w:val="single" w:sz="4" w:space="0" w:color="000000"/>
-              <w:end w:val="single" w:sz="4" w:space="0" w:color="000000"/>
+              <w:right w:val="single" w:sz="4" w:space="0" w:color="000000"/>
             </w:tcBorders>
             <w:shd w:color="auto" w:fill="F3F6FC" w:val="clear"/>
             <w:vAlign w:val="center"/>
@@ -1970,12 +1943,12 @@
         </w:tc>
         <w:tc>
           <w:tcPr>
-            <w:tcW w:w="2000" w:type="dxa"/>
+            <w:tcW w:w="1999" w:type="dxa"/>
             <w:tcBorders>
               <w:top w:val="single" w:sz="4" w:space="0" w:color="000000"/>
-              <w:start w:val="single" w:sz="4" w:space="0" w:color="000000"/>
+              <w:left w:val="single" w:sz="4" w:space="0" w:color="000000"/>
               <w:bottom w:val="single" w:sz="4" w:space="0" w:color="000000"/>
-              <w:end w:val="single" w:sz="4" w:space="0" w:color="000000"/>
+              <w:right w:val="single" w:sz="4" w:space="0" w:color="000000"/>
             </w:tcBorders>
             <w:shd w:color="auto" w:fill="FFFFFF" w:val="clear"/>
             <w:vAlign w:val="center"/>
@@ -2069,7 +2042,7 @@
         <w:pStyle w:val="Normal"/>
         <w:shd w:val="clear" w:color="auto" w:fill="16204F"/>
         <w:spacing w:before="0" w:after="120"/>
-        <w:ind w:start="100" w:end="100"/>
+        <w:ind w:left="100" w:right="100"/>
         <w:rPr/>
       </w:pPr>
       <w:r>
@@ -2091,16 +2064,16 @@
     <w:tbl>
       <w:tblPr>
         <w:tblW w:w="9000" w:type="dxa"/>
-        <w:jc w:val="start"/>
+        <w:jc w:val="left"/>
         <w:tblInd w:w="0" w:type="dxa"/>
         <w:tblLayout w:type="fixed"/>
         <w:tblCellMar>
           <w:top w:w="300" w:type="dxa"/>
-          <w:start w:w="200" w:type="dxa"/>
+          <w:left w:w="200" w:type="dxa"/>
           <w:bottom w:w="300" w:type="dxa"/>
-          <w:end w:w="200" w:type="dxa"/>
+          <w:right w:w="200" w:type="dxa"/>
         </w:tblCellMar>
-        <w:tblLook w:noHBand="0" w:noVBand="0" w:firstColumn="0" w:lastRow="0" w:lastColumn="0" w:firstRow="0" w:val="0000"/>
+        <w:tblLook w:val="0000" w:noHBand="0" w:noVBand="0" w:firstColumn="0" w:lastRow="0" w:lastColumn="0" w:firstRow="0"/>
       </w:tblPr>
       <w:tblGrid>
         <w:gridCol w:w="9000"/>
@@ -2112,9 +2085,9 @@
             <w:tcW w:w="9000" w:type="dxa"/>
             <w:tcBorders>
               <w:top w:val="dashed" w:sz="4" w:space="0" w:color="AAAAAA"/>
-              <w:start w:val="dashed" w:sz="4" w:space="0" w:color="AAAAAA"/>
+              <w:left w:val="dashed" w:sz="4" w:space="0" w:color="AAAAAA"/>
               <w:bottom w:val="dashed" w:sz="4" w:space="0" w:color="AAAAAA"/>
-              <w:end w:val="dashed" w:sz="4" w:space="0" w:color="AAAAAA"/>
+              <w:right w:val="dashed" w:sz="4" w:space="0" w:color="AAAAAA"/>
             </w:tcBorders>
             <w:shd w:color="auto" w:fill="F0F0F0" w:val="clear"/>
           </w:tcPr>
@@ -2160,22 +2133,22 @@
     <w:tbl>
       <w:tblPr>
         <w:tblW w:w="9000" w:type="dxa"/>
-        <w:jc w:val="start"/>
+        <w:jc w:val="left"/>
         <w:tblInd w:w="0" w:type="dxa"/>
         <w:tblLayout w:type="fixed"/>
         <w:tblCellMar>
           <w:top w:w="80" w:type="dxa"/>
-          <w:start w:w="120" w:type="dxa"/>
+          <w:left w:w="120" w:type="dxa"/>
           <w:bottom w:w="80" w:type="dxa"/>
-          <w:end w:w="120" w:type="dxa"/>
+          <w:right w:w="120" w:type="dxa"/>
         </w:tblCellMar>
-        <w:tblLook w:noHBand="0" w:noVBand="0" w:firstColumn="0" w:lastRow="0" w:lastColumn="0" w:firstRow="0" w:val="0000"/>
+        <w:tblLook w:val="0000" w:noHBand="0" w:noVBand="0" w:firstColumn="0" w:lastRow="0" w:lastColumn="0" w:firstRow="0"/>
       </w:tblPr>
       <w:tblGrid>
         <w:gridCol w:w="1800"/>
         <w:gridCol w:w="3600"/>
         <w:gridCol w:w="1600"/>
-        <w:gridCol w:w="2000"/>
+        <w:gridCol w:w="1999"/>
       </w:tblGrid>
       <w:tr>
         <w:trPr/>
@@ -2184,9 +2157,9 @@
             <w:tcW w:w="1800" w:type="dxa"/>
             <w:tcBorders>
               <w:top w:val="single" w:sz="4" w:space="0" w:color="000000"/>
-              <w:start w:val="single" w:sz="4" w:space="0" w:color="000000"/>
+              <w:left w:val="single" w:sz="4" w:space="0" w:color="000000"/>
               <w:bottom w:val="single" w:sz="4" w:space="0" w:color="000000"/>
-              <w:end w:val="single" w:sz="4" w:space="0" w:color="000000"/>
+              <w:right w:val="single" w:sz="4" w:space="0" w:color="000000"/>
             </w:tcBorders>
             <w:shd w:color="auto" w:fill="F3F6FC" w:val="clear"/>
             <w:vAlign w:val="center"/>
@@ -2211,9 +2184,9 @@
             <w:tcW w:w="3600" w:type="dxa"/>
             <w:tcBorders>
               <w:top w:val="single" w:sz="4" w:space="0" w:color="000000"/>
-              <w:start w:val="single" w:sz="4" w:space="0" w:color="000000"/>
+              <w:left w:val="single" w:sz="4" w:space="0" w:color="000000"/>
               <w:bottom w:val="single" w:sz="4" w:space="0" w:color="000000"/>
-              <w:end w:val="single" w:sz="4" w:space="0" w:color="000000"/>
+              <w:right w:val="single" w:sz="4" w:space="0" w:color="000000"/>
             </w:tcBorders>
             <w:shd w:color="auto" w:fill="89B4FA" w:val="clear"/>
             <w:vAlign w:val="center"/>
@@ -2236,9 +2209,9 @@
             <w:tcW w:w="1600" w:type="dxa"/>
             <w:tcBorders>
               <w:top w:val="single" w:sz="4" w:space="0" w:color="000000"/>
-              <w:start w:val="single" w:sz="4" w:space="0" w:color="000000"/>
+              <w:left w:val="single" w:sz="4" w:space="0" w:color="000000"/>
               <w:bottom w:val="single" w:sz="4" w:space="0" w:color="000000"/>
-              <w:end w:val="single" w:sz="4" w:space="0" w:color="000000"/>
+              <w:right w:val="single" w:sz="4" w:space="0" w:color="000000"/>
             </w:tcBorders>
             <w:shd w:color="auto" w:fill="F3F6FC" w:val="clear"/>
             <w:vAlign w:val="center"/>
@@ -2260,12 +2233,12 @@
         </w:tc>
         <w:tc>
           <w:tcPr>
-            <w:tcW w:w="2000" w:type="dxa"/>
+            <w:tcW w:w="1999" w:type="dxa"/>
             <w:tcBorders>
               <w:top w:val="single" w:sz="4" w:space="0" w:color="000000"/>
-              <w:start w:val="single" w:sz="4" w:space="0" w:color="000000"/>
+              <w:left w:val="single" w:sz="4" w:space="0" w:color="000000"/>
               <w:bottom w:val="single" w:sz="4" w:space="0" w:color="000000"/>
-              <w:end w:val="single" w:sz="4" w:space="0" w:color="000000"/>
+              <w:right w:val="single" w:sz="4" w:space="0" w:color="000000"/>
             </w:tcBorders>
             <w:shd w:color="auto" w:fill="FFFFFF" w:val="clear"/>
             <w:vAlign w:val="center"/>
@@ -2359,7 +2332,7 @@
         <w:pStyle w:val="Normal"/>
         <w:shd w:val="clear" w:color="auto" w:fill="16204F"/>
         <w:spacing w:before="0" w:after="120"/>
-        <w:ind w:start="100" w:end="100"/>
+        <w:ind w:left="100" w:right="100"/>
         <w:rPr/>
       </w:pPr>
       <w:r>
@@ -2423,7 +2396,7 @@
   <w:p>
     <w:pPr>
       <w:pStyle w:val="Header"/>
-      <w:jc w:val="end"/>
+      <w:jc w:val="right"/>
       <w:rPr/>
     </w:pPr>
     <w:r>
@@ -2432,7 +2405,7 @@
         <wp:inline distT="0" distB="0" distL="0" distR="0">
           <wp:extent cx="1265555" cy="577850"/>
           <wp:effectExtent l="0" t="0" r="0" b="0"/>
-          <wp:docPr id="5" name="Image2"/>
+          <wp:docPr id="5" name="Image2" descr=""/>
           <wp:cNvGraphicFramePr>
             <a:graphicFrameLocks xmlns:a="http://schemas.openxmlformats.org/drawingml/2006/main" noChangeAspect="1"/>
           </wp:cNvGraphicFramePr>
@@ -2440,7 +2413,7 @@
             <a:graphicData uri="http://schemas.openxmlformats.org/drawingml/2006/picture">
               <pic:pic xmlns:pic="http://schemas.openxmlformats.org/drawingml/2006/picture">
                 <pic:nvPicPr>
-                  <pic:cNvPr id="5" name="Image2"/>
+                  <pic:cNvPr id="5" name="Image2" descr=""/>
                   <pic:cNvPicPr>
                     <a:picLocks noChangeAspect="1" noChangeArrowheads="1"/>
                   </pic:cNvPicPr>
@@ -2476,7 +2449,7 @@
   <w:p>
     <w:pPr>
       <w:pStyle w:val="Header"/>
-      <w:jc w:val="end"/>
+      <w:jc w:val="right"/>
       <w:rPr/>
     </w:pPr>
     <w:r>
@@ -2485,7 +2458,7 @@
         <wp:inline distT="0" distB="0" distL="0" distR="0">
           <wp:extent cx="1265555" cy="577850"/>
           <wp:effectExtent l="0" t="0" r="0" b="0"/>
-          <wp:docPr id="6" name="Image2"/>
+          <wp:docPr id="6" name="Image2" descr=""/>
           <wp:cNvGraphicFramePr>
             <a:graphicFrameLocks xmlns:a="http://schemas.openxmlformats.org/drawingml/2006/main" noChangeAspect="1"/>
           </wp:cNvGraphicFramePr>
@@ -2493,7 +2466,7 @@
             <a:graphicData uri="http://schemas.openxmlformats.org/drawingml/2006/picture">
               <pic:pic xmlns:pic="http://schemas.openxmlformats.org/drawingml/2006/picture">
                 <pic:nvPicPr>
-                  <pic:cNvPr id="6" name="Image2"/>
+                  <pic:cNvPr id="6" name="Image2" descr=""/>
                   <pic:cNvPicPr>
                     <a:picLocks noChangeAspect="1" noChangeArrowheads="1"/>
                   </pic:cNvPicPr>
@@ -2924,9 +2897,10 @@
     <w:qFormat/>
     <w:pPr>
       <w:widowControl/>
+      <w:suppressAutoHyphens w:val="true"/>
       <w:bidi w:val="0"/>
       <w:spacing w:before="0" w:after="0"/>
-      <w:jc w:val="start"/>
+      <w:jc w:val="left"/>
     </w:pPr>
     <w:rPr>
       <w:rFonts w:ascii="Calibri" w:hAnsi="Calibri" w:eastAsia="Calibri" w:cs="Calibri"/>
@@ -2943,9 +2917,10 @@
     <w:qFormat/>
     <w:pPr>
       <w:widowControl/>
+      <w:suppressAutoHyphens w:val="true"/>
       <w:bidi w:val="0"/>
       <w:spacing w:before="0" w:after="0"/>
-      <w:jc w:val="start"/>
+      <w:jc w:val="left"/>
       <w:outlineLvl w:val="0"/>
     </w:pPr>
     <w:rPr>
@@ -2967,9 +2942,10 @@
     <w:qFormat/>
     <w:pPr>
       <w:widowControl/>
+      <w:suppressAutoHyphens w:val="true"/>
       <w:bidi w:val="0"/>
       <w:spacing w:before="0" w:after="0"/>
-      <w:jc w:val="start"/>
+      <w:jc w:val="left"/>
       <w:outlineLvl w:val="1"/>
     </w:pPr>
     <w:rPr>
@@ -2989,9 +2965,10 @@
     <w:qFormat/>
     <w:pPr>
       <w:widowControl/>
+      <w:suppressAutoHyphens w:val="true"/>
       <w:bidi w:val="0"/>
       <w:spacing w:before="0" w:after="0"/>
-      <w:jc w:val="start"/>
+      <w:jc w:val="left"/>
       <w:outlineLvl w:val="2"/>
     </w:pPr>
     <w:rPr>
@@ -3011,9 +2988,10 @@
     <w:qFormat/>
     <w:pPr>
       <w:widowControl/>
+      <w:suppressAutoHyphens w:val="true"/>
       <w:bidi w:val="0"/>
       <w:spacing w:before="0" w:after="0"/>
-      <w:jc w:val="start"/>
+      <w:jc w:val="left"/>
       <w:outlineLvl w:val="3"/>
     </w:pPr>
     <w:rPr>
@@ -3035,9 +3013,10 @@
     <w:qFormat/>
     <w:pPr>
       <w:widowControl/>
+      <w:suppressAutoHyphens w:val="true"/>
       <w:bidi w:val="0"/>
       <w:spacing w:before="0" w:after="0"/>
-      <w:jc w:val="start"/>
+      <w:jc w:val="left"/>
       <w:outlineLvl w:val="4"/>
     </w:pPr>
     <w:rPr>
@@ -3057,9 +3036,10 @@
     <w:qFormat/>
     <w:pPr>
       <w:widowControl/>
+      <w:suppressAutoHyphens w:val="true"/>
       <w:bidi w:val="0"/>
       <w:spacing w:before="0" w:after="0"/>
-      <w:jc w:val="start"/>
+      <w:jc w:val="left"/>
       <w:outlineLvl w:val="5"/>
     </w:pPr>
     <w:rPr>
@@ -3088,11 +3068,18 @@
       <w:u w:val="single"/>
     </w:rPr>
   </w:style>
-  <w:style w:type="character" w:styleId="FootnoteCharacters">
-    <w:name w:val="Footnote Characters"/>
+  <w:style w:type="character" w:styleId="FootnoteCharactersuser">
+    <w:name w:val="Footnote Characters (user)"/>
     <w:uiPriority w:val="99"/>
     <w:semiHidden/>
     <w:unhideWhenUsed/>
+    <w:qFormat/>
+    <w:rPr>
+      <w:vertAlign w:val="superscript"/>
+    </w:rPr>
+  </w:style>
+  <w:style w:type="character" w:styleId="FootnoteCharacters">
+    <w:name w:val="Footnote Characters"/>
     <w:qFormat/>
     <w:rPr>
       <w:vertAlign w:val="superscript"/>
@@ -3116,11 +3103,18 @@
       <w:szCs w:val="20"/>
     </w:rPr>
   </w:style>
-  <w:style w:type="character" w:styleId="EndnoteCharacters">
-    <w:name w:val="Endnote Characters"/>
+  <w:style w:type="character" w:styleId="EndnoteCharactersuser">
+    <w:name w:val="Endnote Characters (user)"/>
     <w:uiPriority w:val="99"/>
     <w:semiHidden/>
     <w:unhideWhenUsed/>
+    <w:qFormat/>
+    <w:rPr>
+      <w:vertAlign w:val="superscript"/>
+    </w:rPr>
+  </w:style>
+  <w:style w:type="character" w:styleId="EndnoteCharacters">
+    <w:name w:val="Endnote Characters"/>
     <w:qFormat/>
     <w:rPr>
       <w:vertAlign w:val="superscript"/>
@@ -3239,9 +3233,10 @@
     <w:qFormat/>
     <w:pPr>
       <w:widowControl/>
+      <w:suppressAutoHyphens w:val="true"/>
       <w:bidi w:val="0"/>
       <w:spacing w:before="0" w:after="0"/>
-      <w:jc w:val="start"/>
+      <w:jc w:val="left"/>
     </w:pPr>
     <w:rPr>
       <w:rFonts w:ascii="Cambria" w:hAnsi="Cambria" w:eastAsia="Cambria" w:cs="Cambria"/>
@@ -3259,9 +3254,10 @@
     <w:qFormat/>
     <w:pPr>
       <w:widowControl/>
+      <w:suppressAutoHyphens w:val="true"/>
       <w:bidi w:val="0"/>
       <w:spacing w:before="0" w:after="0"/>
-      <w:jc w:val="start"/>
+      <w:jc w:val="left"/>
     </w:pPr>
     <w:rPr>
       <w:rFonts w:ascii="Calibri" w:hAnsi="Calibri" w:eastAsia="Calibri" w:cs="Calibri"/>
@@ -3279,9 +3275,10 @@
     <w:qFormat/>
     <w:pPr>
       <w:widowControl/>
+      <w:suppressAutoHyphens w:val="true"/>
       <w:bidi w:val="0"/>
       <w:spacing w:before="0" w:after="0"/>
-      <w:jc w:val="start"/>
+      <w:jc w:val="left"/>
     </w:pPr>
     <w:rPr>
       <w:rFonts w:ascii="Calibri" w:hAnsi="Calibri" w:eastAsia="Calibri" w:cs="Calibri"/>
@@ -3300,9 +3297,10 @@
     <w:unhideWhenUsed/>
     <w:pPr>
       <w:widowControl/>
+      <w:suppressAutoHyphens w:val="true"/>
       <w:bidi w:val="0"/>
       <w:spacing w:before="0" w:after="0"/>
-      <w:jc w:val="start"/>
+      <w:jc w:val="left"/>
     </w:pPr>
     <w:rPr>
       <w:rFonts w:ascii="Calibri" w:hAnsi="Calibri" w:eastAsia="Calibri" w:cs="Calibri"/>
@@ -3321,9 +3319,10 @@
     <w:unhideWhenUsed/>
     <w:pPr>
       <w:widowControl/>
+      <w:suppressAutoHyphens w:val="true"/>
       <w:bidi w:val="0"/>
       <w:spacing w:before="0" w:after="0"/>
-      <w:jc w:val="start"/>
+      <w:jc w:val="left"/>
     </w:pPr>
     <w:rPr>
       <w:rFonts w:ascii="Calibri" w:hAnsi="Calibri" w:eastAsia="Calibri" w:cs="Calibri"/>
@@ -3422,37 +3421,37 @@
         <a:srgbClr val="000000"/>
       </a:dk1>
       <a:lt1>
-        <a:srgbClr val="FFFFFF"/>
+        <a:srgbClr val="ffffff"/>
       </a:lt1>
       <a:dk2>
-        <a:srgbClr val="0E2841"/>
+        <a:srgbClr val="0e2841"/>
       </a:dk2>
       <a:lt2>
-        <a:srgbClr val="E8E8E8"/>
+        <a:srgbClr val="e8e8e8"/>
       </a:lt2>
       <a:accent1>
         <a:srgbClr val="156082"/>
       </a:accent1>
       <a:accent2>
-        <a:srgbClr val="E97132"/>
+        <a:srgbClr val="e97132"/>
       </a:accent2>
       <a:accent3>
-        <a:srgbClr val="196B24"/>
+        <a:srgbClr val="196b24"/>
       </a:accent3>
       <a:accent4>
-        <a:srgbClr val="0F9ED5"/>
+        <a:srgbClr val="0f9ed5"/>
       </a:accent4>
       <a:accent5>
-        <a:srgbClr val="A02B93"/>
+        <a:srgbClr val="a02b93"/>
       </a:accent5>
       <a:accent6>
-        <a:srgbClr val="4EA72E"/>
+        <a:srgbClr val="4ea72e"/>
       </a:accent6>
       <a:hlink>
         <a:srgbClr val="467886"/>
       </a:hlink>
       <a:folHlink>
-        <a:srgbClr val="96607D"/>
+        <a:srgbClr val="96607d"/>
       </a:folHlink>
     </a:clrScheme>
     <a:fontScheme name="Office">

</xml_diff>